<commit_message>
Trim JEP_Paper_trimmed abstract to ~200 words; preserve user edits
Abstract reduced from 307 to 203 words to meet a 200-word limit.
Preserves three manual user edits in the introduction and case study:
the Free-School-Meal acronym definition, the new scope-of-argument
paragraph, and the housing-premium framing.
</commit_message>
<xml_diff>
--- a/JEP_Paper_trimmed.docx
+++ b/JEP_Paper_trimmed.docx
@@ -63,23 +63,23 @@
         <w:pStyle w:val="Abstract"/>
       </w:pPr>
       <w:r>
-        <w:t xml:space="preserve">In its 2026 White Paper, the UK government has set a worthwhile and ambitious target to halve the disadvantage attainment gap in education. Achieving improvements in disadvantaged student attainment requires local education authorities to understand their local situations and the specific drivers in their areas. But it is all too easy to pull the wrong policy lever when the research is complex and local intelligence is incomplete. Recent experiences in Brighton and Hove have highlighted the gap between open data and actionable information for Policy Makers, Schools and anyone wanting to actively contribute to statutory public consultations. Using multilevel linear mixed effects models fitted to all state-funded secondary schools in England over four years (2021–22 to 2024–25), we show that school-level Attainment 8 is highly predictable from a small number of readily available variables, but non-linearities mean understanding local context is key. We apply these models to a case study of Brighton and Hove, where admissions policy proposals in 2024 were designed around the premise that attainment is reduced by lower socio-economic mixing across schools. Our analysis suggests these proposals are unlikely to deliver the targeted gains in disadvantaged attainment, and that the wider literature on long school commutes points to social and educational costs that the proposals did not consider. By contrast, Brighton and Hove has the second worst absence rate in England, and our modelling indicates that improving attendance in the city would be the most impactful single lever available for raising attainment — particularly for disadvantaged pupils. We also introduce a school-level value-added view that allows parents and policy makers to assess how a school is performing</w:t>
-      </w:r>
-      <w:r>
-        <w:t xml:space="preserve"> </w:t>
-      </w:r>
-      <w:r>
-        <w:rPr>
-          <w:i/>
-          <w:iCs/>
-        </w:rPr>
-        <w:t xml:space="preserve">over and above</w:t>
-      </w:r>
-      <w:r>
-        <w:t xml:space="preserve"> </w:t>
-      </w:r>
-      <w:r>
-        <w:t xml:space="preserve">the structural intake characteristics it inherits, helping support better-informed local decisions. We introduce a new policy simulator tool to help bridge the gap between the Department for Education’s open data and accessible, contextualised intelligence.</w:t>
+        <w:t xml:space="preserve">The UK’s 2026 White Paper targets halving the disadvantage attainment gap. Achieving this requires local education authorities to understand the drivers of attainment in their areas, but the wrong lever is easily pulled when research is complex and local intelligence incomplete. Using multilevel mixed-effects models fitted to all state-funded secondary schools in England over four years (2021–22 to 2024–25), we show school-level Attainment 8 is highly predictable from a handful of readily available variables, though non-linearities mean local context is key. We apply the models to Brighton and Hove, where 2024 admissions proposals were premised on the idea that attainment is reduced by lower socio-economic mixing. Our analysis suggests these proposals are unlikely to deliver the targeted gains, and the wider literature on long school commutes points to social and educational costs they did not consider. By contrast, the city has the second-worst absence rate in England, and our modelling indicates improving attendance would be the most impactful single lever, particularly for disadvantaged pupils. We also introduce a school-level value-added view that lets parents and policy makers assess how a school performs</w:t>
+      </w:r>
+      <w:r>
+        <w:t xml:space="preserve"> </w:t>
+      </w:r>
+      <w:r>
+        <w:rPr>
+          <w:i/>
+          <w:iCs/>
+        </w:rPr>
+        <w:t xml:space="preserve">above</w:t>
+      </w:r>
+      <w:r>
+        <w:t xml:space="preserve"> </w:t>
+      </w:r>
+      <w:r>
+        <w:t xml:space="preserve">its inherited intake characteristics, and a policy simulator tool to bridge the gap between open data and accessible, contextualised intelligence.</w:t>
       </w:r>
     </w:p>
     <w:bookmarkStart w:id="22" w:name="introduction"/>
@@ -154,7 +154,7 @@
         <w:t xml:space="preserve">(Allen et al. 2013)</w:t>
       </w:r>
       <w:r>
-        <w:t xml:space="preserve">, and an admissions priority for FSM-eligible pupils across its community schools. In 2024, the council launched proposals to reduce Published Admission Numbers at popular central-catchment schools, reserve places for out-of-catchment children in those catchments ahead of in-catchment children, and redraw catchment boundaries. The proposals were promoted on the premise that attainment in the city was</w:t>
+        <w:t xml:space="preserve">, and an admissions priority for Free-School-Meal (FSM)-eligible pupils across its community schools. In 2024, the council launched proposals to reduce Published Admission Numbers at popular central-catchment schools, reserve places for out-of-catchment children in those catchments ahead of in-catchment children, and redraw catchment boundaries. The proposals were promoted on the premise that attainment in the city was</w:t>
       </w:r>
       <w:r>
         <w:t xml:space="preserve"> </w:t>
@@ -255,6 +255,14 @@
       </w:r>
       <w:r>
         <w:t xml:space="preserve">. We report effects in GCSE-point units rather than standard deviations so that they have more direct meaning for policy makers.</w:t>
+      </w:r>
+    </w:p>
+    <w:p>
+      <w:pPr>
+        <w:pStyle w:val="BodyText"/>
+      </w:pPr>
+      <w:r>
+        <w:t xml:space="preserve">Before examining the Brighton and Hove proposals specifically later in the paper, we wish to be explicit about the scope of our argument. Our models measure attainment outcomes only; they cannot speak to the broader social, civic and developmental value of diverse school communities, which we do not dispute. We are also aware that our findings regarding concentrations of disadvantaged students could be read selectively to justify resistance to integration efforts in general — that is not our argument. Our claim is specific: in this city, at this time, with this evidence base, the proposed mixing intervention was not the most impactful lever available for disadvantaged student attainment, and carried costs the consultation did not adequately weigh.</w:t>
       </w:r>
     </w:p>
     <w:p>
@@ -4375,7 +4383,7 @@
         <w:t xml:space="preserve"> </w:t>
       </w:r>
       <w:r>
-        <w:t xml:space="preserve">— a characterisation challenged in this context by</w:t>
+        <w:t xml:space="preserve">— a framing that implied that those who could afford to do so paid a housing premium to be near better schools in the city, but a characterisation empirically challenged in this context by</w:t>
       </w:r>
       <w:r>
         <w:t xml:space="preserve"> </w:t>

</xml_diff>

<commit_message>
Reorder authors: Dennett, Taylor, Campbell-Meiklejohn
Adam → Beatrice → Dan, applied in YAML metadata, LaTeX authblk header,
and CRediT statement.
</commit_message>
<xml_diff>
--- a/JEP_Paper_trimmed.docx
+++ b/JEP_Paper_trimmed.docx
@@ -31,15 +31,15 @@
         <w:pStyle w:val="Author"/>
       </w:pPr>
       <w:r>
+        <w:t xml:space="preserve">Beatrice Taylor</w:t>
+      </w:r>
+    </w:p>
+    <w:p>
+      <w:pPr>
+        <w:pStyle w:val="Author"/>
+      </w:pPr>
+      <w:r>
         <w:t xml:space="preserve">Dan Campbell-Meiklejohn</w:t>
-      </w:r>
-    </w:p>
-    <w:p>
-      <w:pPr>
-        <w:pStyle w:val="Author"/>
-      </w:pPr>
-      <w:r>
-        <w:t xml:space="preserve">Beatrice Taylor</w:t>
       </w:r>
     </w:p>
     <w:p>
@@ -8070,7 +8070,7 @@
           <w:b/>
           <w:bCs/>
         </w:rPr>
-        <w:t xml:space="preserve">Dan Campbell-Meiklejohn:</w:t>
+        <w:t xml:space="preserve">Beatrice Taylor:</w:t>
       </w:r>
       <w:r>
         <w:t xml:space="preserve"> </w:t>
@@ -8086,7 +8086,7 @@
           <w:b/>
           <w:bCs/>
         </w:rPr>
-        <w:t xml:space="preserve">Beatrice Taylor:</w:t>
+        <w:t xml:space="preserve">Dan Campbell-Meiklejohn:</w:t>
       </w:r>
       <w:r>
         <w:t xml:space="preserve"> </w:t>

</xml_diff>